<commit_message>
CAT folio: each prompt names one of the six ideas from the posters
Co-Authored-By: Claude Fable 5.1 <noreply@anthropic.com>
Claude-Session: https://claude.ai/code/session_01TX2KYiJGekMNoBBPASQh6e
</commit_message>
<xml_diff>
--- a/BoneSparrow-CAT-folio-ideas.docx
+++ b/BoneSparrow-CAT-folio-ideas.docx
@@ -1204,7 +1204,7 @@
           </w:tcPr>
           <w:p>
             <w:pPr>
-              <w:spacing w:after="0"/>
+              <w:spacing w:after="60"/>
             </w:pPr>
             <w:r>
               <w:rPr>
@@ -1213,7 +1213,7 @@
                 <w:sz w:val="22"/>
                 <w:szCs w:val="22"/>
               </w:rPr>
-              <w:t xml:space="preserve">How does Fraillon show that the </w:t>
+              <w:t xml:space="preserve">How does Fraillon show that </w:t>
             </w:r>
             <w:r>
               <w:rPr>
@@ -1234,7 +1234,7 @@
                 <w:sz w:val="22"/>
                 <w:szCs w:val="22"/>
               </w:rPr>
-              <w:t xml:space="preserve"> the characters keep help them </w:t>
+              <w:t xml:space="preserve"> and </w:t>
             </w:r>
             <w:r>
               <w:rPr>
@@ -1246,7 +1246,7 @@
                 <w:szCs w:val="22"/>
                 <w:shd w:fill="D6EAFC" w:val="clear"/>
               </w:rPr>
-              <w:t xml:space="preserve">hold on to who they are</w:t>
+              <w:t xml:space="preserve">family</w:t>
             </w:r>
             <w:r>
               <w:rPr>
@@ -1255,7 +1255,21 @@
                 <w:sz w:val="22"/>
                 <w:szCs w:val="22"/>
               </w:rPr>
-              <w:t xml:space="preserve">?</w:t>
+              <w:t xml:space="preserve"> help the characters hold on to who they are?</w:t>
+            </w:r>
+          </w:p>
+          <w:p>
+            <w:pPr>
+              <w:spacing w:after="0"/>
+            </w:pPr>
+            <w:r>
+              <w:rPr>
+                <w:rFonts w:ascii="Calibri" w:cs="Calibri" w:eastAsia="Calibri" w:hAnsi="Calibri"/>
+                <w:color w:val="645D54"/>
+                <w:sz w:val="18"/>
+                <w:szCs w:val="18"/>
+              </w:rPr>
+              <w:t xml:space="preserve">Posters: Friendship and family</w:t>
             </w:r>
           </w:p>
         </w:tc>
@@ -4400,7 +4414,7 @@
           </w:tcPr>
           <w:p>
             <w:pPr>
-              <w:spacing w:after="0"/>
+              <w:spacing w:after="60"/>
             </w:pPr>
             <w:r>
               <w:rPr>
@@ -4452,6 +4466,20 @@
                 <w:szCs w:val="22"/>
               </w:rPr>
               <w:t xml:space="preserve"> in The Bone Sparrow?</w:t>
+            </w:r>
+          </w:p>
+          <w:p>
+            <w:pPr>
+              <w:spacing w:after="0"/>
+            </w:pPr>
+            <w:r>
+              <w:rPr>
+                <w:rFonts w:ascii="Calibri" w:cs="Calibri" w:eastAsia="Calibri" w:hAnsi="Calibri"/>
+                <w:color w:val="645D54"/>
+                <w:sz w:val="18"/>
+                <w:szCs w:val="18"/>
+              </w:rPr>
+              <w:t xml:space="preserve">Posters: Freedom · Imprisonment</w:t>
             </w:r>
           </w:p>
         </w:tc>
@@ -7614,7 +7642,7 @@
           </w:tcPr>
           <w:p>
             <w:pPr>
-              <w:spacing w:after="0"/>
+              <w:spacing w:after="60"/>
             </w:pPr>
             <w:r>
               <w:rPr>
@@ -7666,6 +7694,20 @@
                 <w:szCs w:val="22"/>
               </w:rPr>
               <w:t xml:space="preserve"> in The Bone Sparrow?</w:t>
+            </w:r>
+          </w:p>
+          <w:p>
+            <w:pPr>
+              <w:spacing w:after="0"/>
+            </w:pPr>
+            <w:r>
+              <w:rPr>
+                <w:rFonts w:ascii="Calibri" w:cs="Calibri" w:eastAsia="Calibri" w:hAnsi="Calibri"/>
+                <w:color w:val="645D54"/>
+                <w:sz w:val="18"/>
+                <w:szCs w:val="18"/>
+              </w:rPr>
+              <w:t xml:space="preserve">Posters: Storytelling · Imagination</w:t>
             </w:r>
           </w:p>
         </w:tc>

</xml_diff>

<commit_message>
CAT folio: cover lists the tasks by number only
Co-Authored-By: Claude Fable 5.1 <noreply@anthropic.com>
Claude-Session: https://claude.ai/code/session_01TX2KYiJGekMNoBBPASQh6e
</commit_message>
<xml_diff>
--- a/BoneSparrow-CAT-folio-ideas.docx
+++ b/BoneSparrow-CAT-folio-ideas.docx
@@ -947,7 +947,7 @@
                 <w:sz w:val="22"/>
                 <w:szCs w:val="22"/>
               </w:rPr>
-              <w:t xml:space="preserve">Task 1 — Symbolism and identity</w:t>
+              <w:t xml:space="preserve">Task 1</w:t>
             </w:r>
           </w:p>
         </w:tc>
@@ -1027,7 +1027,7 @@
                 <w:sz w:val="22"/>
                 <w:szCs w:val="22"/>
               </w:rPr>
-              <w:t xml:space="preserve">Task 2 — Contrast and freedom</w:t>
+              <w:t xml:space="preserve">Task 2</w:t>
             </w:r>
           </w:p>
         </w:tc>
@@ -1107,7 +1107,7 @@
                 <w:sz w:val="22"/>
                 <w:szCs w:val="22"/>
               </w:rPr>
-              <w:t xml:space="preserve">Task 3 — Motif and storytelling</w:t>
+              <w:t xml:space="preserve">Task 3</w:t>
             </w:r>
           </w:p>
         </w:tc>

</xml_diff>

<commit_message>
CAT folio: Teacher B's version coloured one colour per sentence, as his original; front sheet matches the intro gaps
Co-Authored-By: Claude Fable 5.1 <noreply@anthropic.com>
Claude-Session: https://claude.ai/code/session_01TX2KYiJGekMNoBBPASQh6e
</commit_message>
<xml_diff>
--- a/BoneSparrow-CAT-folio-ideas.docx
+++ b/BoneSparrow-CAT-folio-ideas.docx
@@ -235,7 +235,7 @@
                 <w:sz w:val="22"/>
                 <w:szCs w:val="22"/>
               </w:rPr>
-              <w:t xml:space="preserve">Three sittings, one prompt each. In each: one paragraph of your own (approximately 150–200 words), and a second if you get there.</w:t>
+              <w:t xml:space="preserve">Three sittings, one prompt each. In each: finish the introduction, write one paragraph of your own (approximately 150–200 words) and the conclusion, and a second paragraph if you get there.</w:t>
             </w:r>
           </w:p>
         </w:tc>
@@ -433,7 +433,7 @@
           <w:sz w:val="22"/>
           <w:szCs w:val="22"/>
         </w:rPr>
-        <w:t xml:space="preserve">The introduction and the first paragraph are written for you. Write the next paragraph.</w:t>
+        <w:t xml:space="preserve">The introduction is started and the first paragraph is written for you. Finish the introduction, then write the next paragraph.</w:t>
       </w:r>
     </w:p>
     <w:p>

</xml_diff>

<commit_message>
CAT folio: no class-specific names, one option on task 1, effect clause in each model, 40 minutes; CAT lesson plan links the folio files
Co-Authored-By: Claude Fable 5.1 <noreply@anthropic.com>
Claude-Session: https://claude.ai/code/session_01TX2KYiJGekMNoBBPASQh6e
</commit_message>
<xml_diff>
--- a/BoneSparrow-CAT-folio-ideas.docx
+++ b/BoneSparrow-CAT-folio-ideas.docx
@@ -290,7 +290,7 @@
                 <w:sz w:val="22"/>
                 <w:szCs w:val="22"/>
               </w:rPr>
-              <w:t xml:space="preserve">Test conditions. On your table: a copy of the text, a dictionary, your quote-hunt sheet, one page of your own notes. No pre-written paragraphs or essays. No devices.</w:t>
+              <w:t xml:space="preserve">Test conditions. On your table: a copy of the text, a dictionary, one page of your own notes. No pre-written paragraphs or essays. No devices.</w:t>
             </w:r>
           </w:p>
         </w:tc>
@@ -345,7 +345,7 @@
                 <w:sz w:val="22"/>
                 <w:szCs w:val="22"/>
               </w:rPr>
-              <w:t xml:space="preserve">40 minutes writing time + 10 minutes planning, each sitting</w:t>
+              <w:t xml:space="preserve">40 minutes, each sitting</w:t>
             </w:r>
           </w:p>
         </w:tc>
@@ -1239,20 +1239,6 @@
               <w:t xml:space="preserve">Consider what the bone sparrow necklace represents, how it was made and by whom, and what Subhi’s relationship to it suggests about identity and heritage. You might also think about Subhi’s treasures, Jimmie’s necklace, or the family around Subhi.</w:t>
             </w:r>
           </w:p>
-          <w:p>
-            <w:pPr>
-              <w:spacing w:after="0"/>
-            </w:pPr>
-            <w:r>
-              <w:rPr>
-                <w:rFonts w:ascii="Georgia" w:cs="Georgia" w:eastAsia="Georgia" w:hAnsi="Georgia"/>
-                <w:color w:val="645D54"/>
-                <w:sz w:val="18"/>
-                <w:szCs w:val="18"/>
-              </w:rPr>
-              <w:t xml:space="preserve">Posters: Friendship and family</w:t>
-            </w:r>
-          </w:p>
         </w:tc>
       </w:tr>
     </w:tbl>
@@ -2022,6 +2008,27 @@
                 <w:sz w:val="23"/>
                 <w:szCs w:val="23"/>
               </w:rPr>
+              <w:t xml:space="preserve">, so </w:t>
+            </w:r>
+            <w:r>
+              <w:rPr>
+                <w:rFonts w:ascii="Georgia" w:cs="Georgia" w:eastAsia="Georgia" w:hAnsi="Georgia"/>
+                <w:b/>
+                <w:bCs/>
+                <w:color w:val="1F5C33"/>
+                <w:sz w:val="23"/>
+                <w:szCs w:val="23"/>
+                <w:shd w:fill="DFF0E2" w:val="clear"/>
+              </w:rPr>
+              <w:t xml:space="preserve">the reader sees why Jimmie holds on to it</w:t>
+            </w:r>
+            <w:r>
+              <w:rPr>
+                <w:rFonts w:ascii="Georgia" w:cs="Georgia" w:eastAsia="Georgia" w:hAnsi="Georgia"/>
+                <w:color w:val="1E211F"/>
+                <w:sz w:val="23"/>
+                <w:szCs w:val="23"/>
+              </w:rPr>
               <w:t xml:space="preserve">.</w:t>
             </w:r>
           </w:p>
@@ -2252,6 +2259,27 @@
                 <w:shd w:fill="D6EAFC" w:val="clear"/>
               </w:rPr>
               <w:t xml:space="preserve">the things Subhi keeps are his only link to a father he has never met</w:t>
+            </w:r>
+            <w:r>
+              <w:rPr>
+                <w:rFonts w:ascii="Georgia" w:cs="Georgia" w:eastAsia="Georgia" w:hAnsi="Georgia"/>
+                <w:color w:val="1E211F"/>
+                <w:sz w:val="23"/>
+                <w:szCs w:val="23"/>
+              </w:rPr>
+              <w:t xml:space="preserve">, which </w:t>
+            </w:r>
+            <w:r>
+              <w:rPr>
+                <w:rFonts w:ascii="Georgia" w:cs="Georgia" w:eastAsia="Georgia" w:hAnsi="Georgia"/>
+                <w:b/>
+                <w:bCs/>
+                <w:color w:val="1F5C33"/>
+                <w:sz w:val="23"/>
+                <w:szCs w:val="23"/>
+                <w:shd w:fill="DFF0E2" w:val="clear"/>
+              </w:rPr>
+              <w:t xml:space="preserve">makes the reader feel how much a small thing can hold</w:t>
             </w:r>
             <w:r>
               <w:rPr>
@@ -2526,32 +2554,7 @@
           <w:sz w:val="18"/>
           <w:szCs w:val="18"/>
         </w:rPr>
-        <w:t xml:space="preserve">Paragraph 1 is objects. Paragraph 2 is the idea you wrote second in your introduction.</w:t>
-      </w:r>
-    </w:p>
-    <w:p>
-      <w:pPr>
-        <w:spacing w:after="80"/>
-      </w:pPr>
-      <w:r>
-        <w:rPr>
-          <w:rFonts w:ascii="Georgia" w:cs="Georgia" w:eastAsia="Georgia" w:hAnsi="Georgia"/>
-          <w:b/>
-          <w:bCs/>
-          <w:color w:val="1E211F"/>
-          <w:sz w:val="22"/>
-          <w:szCs w:val="22"/>
-        </w:rPr>
-        <w:t xml:space="preserve">I will write about:  </w:t>
-      </w:r>
-      <w:r>
-        <w:rPr>
-          <w:rFonts w:ascii="Georgia" w:cs="Georgia" w:eastAsia="Georgia" w:hAnsi="Georgia"/>
-          <w:color w:val="1E211F"/>
-          <w:sz w:val="22"/>
-          <w:szCs w:val="22"/>
-        </w:rPr>
-        <w:t xml:space="preserve">☐ the family around Subhi     ☐ Jimmie’s family and what her mother left her</w:t>
+        <w:t xml:space="preserve">Paragraph 1 is objects. Paragraph 2 is family, the idea you wrote second in your introduction.</w:t>
       </w:r>
     </w:p>
     <w:tbl>
@@ -6239,20 +6242,6 @@
                 <w:szCs w:val="18"/>
               </w:rPr>
               <w:t xml:space="preserve">Consider inside and outside the fence; Subhi’s body locked in and his imagination free; Subhi’s world and Jimmie’s; the objects that stand for freedom and for being locked up.</w:t>
-            </w:r>
-          </w:p>
-          <w:p>
-            <w:pPr>
-              <w:spacing w:after="0"/>
-            </w:pPr>
-            <w:r>
-              <w:rPr>
-                <w:rFonts w:ascii="Georgia" w:cs="Georgia" w:eastAsia="Georgia" w:hAnsi="Georgia"/>
-                <w:color w:val="645D54"/>
-                <w:sz w:val="18"/>
-                <w:szCs w:val="18"/>
-              </w:rPr>
-              <w:t xml:space="preserve">Posters: Freedom · Imprisonment</w:t>
             </w:r>
           </w:p>
         </w:tc>
@@ -7054,6 +7043,27 @@
                 <w:sz w:val="23"/>
                 <w:szCs w:val="23"/>
               </w:rPr>
+              <w:t xml:space="preserve">, which </w:t>
+            </w:r>
+            <w:r>
+              <w:rPr>
+                <w:rFonts w:ascii="Georgia" w:cs="Georgia" w:eastAsia="Georgia" w:hAnsi="Georgia"/>
+                <w:b/>
+                <w:bCs/>
+                <w:color w:val="1F5C33"/>
+                <w:sz w:val="23"/>
+                <w:szCs w:val="23"/>
+                <w:shd w:fill="DFF0E2" w:val="clear"/>
+              </w:rPr>
+              <w:t xml:space="preserve">makes the reader feel how small Subhi’s world is</w:t>
+            </w:r>
+            <w:r>
+              <w:rPr>
+                <w:rFonts w:ascii="Georgia" w:cs="Georgia" w:eastAsia="Georgia" w:hAnsi="Georgia"/>
+                <w:color w:val="1E211F"/>
+                <w:sz w:val="23"/>
+                <w:szCs w:val="23"/>
+              </w:rPr>
               <w:t xml:space="preserve">.</w:t>
             </w:r>
           </w:p>
@@ -7284,6 +7294,27 @@
                 <w:shd w:fill="D6EAFC" w:val="clear"/>
               </w:rPr>
               <w:t xml:space="preserve">a friend from the other side is his only window on the world</w:t>
+            </w:r>
+            <w:r>
+              <w:rPr>
+                <w:rFonts w:ascii="Georgia" w:cs="Georgia" w:eastAsia="Georgia" w:hAnsi="Georgia"/>
+                <w:color w:val="1E211F"/>
+                <w:sz w:val="23"/>
+                <w:szCs w:val="23"/>
+              </w:rPr>
+              <w:t xml:space="preserve">, which </w:t>
+            </w:r>
+            <w:r>
+              <w:rPr>
+                <w:rFonts w:ascii="Georgia" w:cs="Georgia" w:eastAsia="Georgia" w:hAnsi="Georgia"/>
+                <w:b/>
+                <w:bCs/>
+                <w:color w:val="1F5C33"/>
+                <w:sz w:val="23"/>
+                <w:szCs w:val="23"/>
+                <w:shd w:fill="DFF0E2" w:val="clear"/>
+              </w:rPr>
+              <w:t xml:space="preserve">makes the reader see how much rests on one friendship</w:t>
             </w:r>
             <w:r>
               <w:rPr>
@@ -7546,24 +7577,13 @@
           <w:sz w:val="18"/>
           <w:szCs w:val="18"/>
         </w:rPr>
-        <w:t xml:space="preserve">Paragraph 1 is the fence. Paragraph 2 is the idea you wrote second in your introduction.</w:t>
+        <w:t xml:space="preserve">Paragraph 1 is the fence. Paragraph 2 is the idea you wrote second in your introduction:</w:t>
       </w:r>
     </w:p>
     <w:p>
       <w:pPr>
         <w:spacing w:after="80"/>
       </w:pPr>
-      <w:r>
-        <w:rPr>
-          <w:rFonts w:ascii="Georgia" w:cs="Georgia" w:eastAsia="Georgia" w:hAnsi="Georgia"/>
-          <w:b/>
-          <w:bCs/>
-          <w:color w:val="1E211F"/>
-          <w:sz w:val="22"/>
-          <w:szCs w:val="22"/>
-        </w:rPr>
-        <w:t xml:space="preserve">I will write about:  </w:t>
-      </w:r>
       <w:r>
         <w:rPr>
           <w:rFonts w:ascii="Georgia" w:cs="Georgia" w:eastAsia="Georgia" w:hAnsi="Georgia"/>
@@ -11195,20 +11215,6 @@
                 <w:szCs w:val="18"/>
               </w:rPr>
               <w:t xml:space="preserve">Consider Maá’s Listen Now stories; Jimmie’s family book; the stories Subhi tells himself; what happens when the stories stop.</w:t>
-            </w:r>
-          </w:p>
-          <w:p>
-            <w:pPr>
-              <w:spacing w:after="0"/>
-            </w:pPr>
-            <w:r>
-              <w:rPr>
-                <w:rFonts w:ascii="Georgia" w:cs="Georgia" w:eastAsia="Georgia" w:hAnsi="Georgia"/>
-                <w:color w:val="645D54"/>
-                <w:sz w:val="18"/>
-                <w:szCs w:val="18"/>
-              </w:rPr>
-              <w:t xml:space="preserve">Posters: Storytelling · Imagination</w:t>
             </w:r>
           </w:p>
         </w:tc>
@@ -11980,6 +11986,27 @@
                 <w:sz w:val="23"/>
                 <w:szCs w:val="23"/>
               </w:rPr>
+              <w:t xml:space="preserve">, which </w:t>
+            </w:r>
+            <w:r>
+              <w:rPr>
+                <w:rFonts w:ascii="Georgia" w:cs="Georgia" w:eastAsia="Georgia" w:hAnsi="Georgia"/>
+                <w:b/>
+                <w:bCs/>
+                <w:color w:val="1F5C33"/>
+                <w:sz w:val="23"/>
+                <w:szCs w:val="23"/>
+                <w:shd w:fill="DFF0E2" w:val="clear"/>
+              </w:rPr>
+              <w:t xml:space="preserve">makes the reader feel what the stories are worth</w:t>
+            </w:r>
+            <w:r>
+              <w:rPr>
+                <w:rFonts w:ascii="Georgia" w:cs="Georgia" w:eastAsia="Georgia" w:hAnsi="Georgia"/>
+                <w:color w:val="1E211F"/>
+                <w:sz w:val="23"/>
+                <w:szCs w:val="23"/>
+              </w:rPr>
               <w:t xml:space="preserve">.</w:t>
             </w:r>
           </w:p>
@@ -12210,6 +12237,27 @@
                 <w:shd w:fill="D6EAFC" w:val="clear"/>
               </w:rPr>
               <w:t xml:space="preserve">a story changes how a person feels just by being there</w:t>
+            </w:r>
+            <w:r>
+              <w:rPr>
+                <w:rFonts w:ascii="Georgia" w:cs="Georgia" w:eastAsia="Georgia" w:hAnsi="Georgia"/>
+                <w:color w:val="1E211F"/>
+                <w:sz w:val="23"/>
+                <w:szCs w:val="23"/>
+              </w:rPr>
+              <w:t xml:space="preserve">, which </w:t>
+            </w:r>
+            <w:r>
+              <w:rPr>
+                <w:rFonts w:ascii="Georgia" w:cs="Georgia" w:eastAsia="Georgia" w:hAnsi="Georgia"/>
+                <w:b/>
+                <w:bCs/>
+                <w:color w:val="1F5C33"/>
+                <w:sz w:val="23"/>
+                <w:szCs w:val="23"/>
+                <w:shd w:fill="DFF0E2" w:val="clear"/>
+              </w:rPr>
+              <w:t xml:space="preserve">makes the reader see the book as a kind of company</w:t>
             </w:r>
             <w:r>
               <w:rPr>
@@ -12472,24 +12520,13 @@
           <w:sz w:val="18"/>
           <w:szCs w:val="18"/>
         </w:rPr>
-        <w:t xml:space="preserve">Paragraph 1 is Maá’s stories and Jimmie’s book. Paragraph 2 is the idea you wrote second in your introduction.</w:t>
+        <w:t xml:space="preserve">Paragraph 1 is Maá’s stories and Jimmie’s book. Paragraph 2 is the idea you wrote second in your introduction:</w:t>
       </w:r>
     </w:p>
     <w:p>
       <w:pPr>
         <w:spacing w:after="80"/>
       </w:pPr>
-      <w:r>
-        <w:rPr>
-          <w:rFonts w:ascii="Georgia" w:cs="Georgia" w:eastAsia="Georgia" w:hAnsi="Georgia"/>
-          <w:b/>
-          <w:bCs/>
-          <w:color w:val="1E211F"/>
-          <w:sz w:val="22"/>
-          <w:szCs w:val="22"/>
-        </w:rPr>
-        <w:t xml:space="preserve">I will write about:  </w:t>
-      </w:r>
       <w:r>
         <w:rPr>
           <w:rFonts w:ascii="Georgia" w:cs="Georgia" w:eastAsia="Georgia" w:hAnsi="Georgia"/>
@@ -16375,7 +16412,7 @@
                 <w:sz w:val="17"/>
                 <w:szCs w:val="17"/>
               </w:rPr>
-              <w:t xml:space="preserve">I can identify parts of the story that relate to key ideas (imprisonment, loneliness, stories, etc)</w:t>
+              <w:t xml:space="preserve">I can identify parts of the story that relate to key ideas (imprisonment, loneliness, stories)</w:t>
             </w:r>
           </w:p>
         </w:tc>

</xml_diff>